<commit_message>
Actualizacion de link de repositorio
en el documento de evidencias
</commit_message>
<xml_diff>
--- a/control-tareas/evidencias/Evidencias_Maven_HTTP_REST_KevinRivera.docx
+++ b/control-tareas/evidencias/Evidencias_Maven_HTTP_REST_KevinRivera.docx
@@ -523,7 +523,16 @@
           <w:szCs w:val="28"/>
           <w:lang w:val="es-ES"/>
         </w:rPr>
-        <w:t xml:space="preserve">Enlace del repositorio: </w:t>
+        <w:t>Enlace del repositorio:</w:t>
+      </w:r>
+      <w:r>
+        <w:rPr>
+          <w:rFonts w:ascii="Times New Roman" w:hAnsi="Times New Roman" w:cs="Times New Roman"/>
+          <w:sz w:val="28"/>
+          <w:szCs w:val="28"/>
+          <w:lang w:val="es-ES"/>
+        </w:rPr>
+        <w:t xml:space="preserve"> </w:t>
       </w:r>
       <w:hyperlink r:id="rId7" w:history="1">
         <w:r>
@@ -549,7 +558,6 @@
     </w:p>
     <w:p>
       <w:pPr>
-        <w:ind w:left="708" w:hanging="708"/>
         <w:jc w:val="center"/>
         <w:rPr>
           <w:rFonts w:ascii="Times New Roman" w:hAnsi="Times New Roman" w:cs="Times New Roman"/>
@@ -558,17 +566,15 @@
           <w:lang w:val="es-ES"/>
         </w:rPr>
       </w:pPr>
-    </w:p>
-    <w:p>
-      <w:pPr>
-        <w:jc w:val="center"/>
+      <w:r>
         <w:rPr>
           <w:rFonts w:ascii="Times New Roman" w:hAnsi="Times New Roman" w:cs="Times New Roman"/>
           <w:sz w:val="28"/>
           <w:szCs w:val="28"/>
           <w:lang w:val="es-ES"/>
         </w:rPr>
-      </w:pPr>
+        <w:t>Guatemala, 2</w:t>
+      </w:r>
       <w:r>
         <w:rPr>
           <w:rFonts w:ascii="Times New Roman" w:hAnsi="Times New Roman" w:cs="Times New Roman"/>
@@ -576,7 +582,7 @@
           <w:szCs w:val="28"/>
           <w:lang w:val="es-ES"/>
         </w:rPr>
-        <w:t>Guatemala, 2</w:t>
+        <w:t>8</w:t>
       </w:r>
       <w:r>
         <w:rPr>
@@ -585,7 +591,7 @@
           <w:szCs w:val="28"/>
           <w:lang w:val="es-ES"/>
         </w:rPr>
-        <w:t>8</w:t>
+        <w:t xml:space="preserve"> de </w:t>
       </w:r>
       <w:r>
         <w:rPr>
@@ -594,7 +600,7 @@
           <w:szCs w:val="28"/>
           <w:lang w:val="es-ES"/>
         </w:rPr>
-        <w:t xml:space="preserve"> de </w:t>
+        <w:t>septiembre</w:t>
       </w:r>
       <w:r>
         <w:rPr>
@@ -603,17 +609,16 @@
           <w:szCs w:val="28"/>
           <w:lang w:val="es-ES"/>
         </w:rPr>
-        <w:t>septiembre</w:t>
-      </w:r>
-      <w:r>
-        <w:rPr>
-          <w:rFonts w:ascii="Times New Roman" w:hAnsi="Times New Roman" w:cs="Times New Roman"/>
-          <w:sz w:val="28"/>
-          <w:szCs w:val="28"/>
+        <w:t xml:space="preserve"> de 2026</w:t>
+      </w:r>
+    </w:p>
+    <w:p>
+      <w:pPr>
+        <w:rPr>
+          <w:rFonts w:ascii="Times New Roman" w:hAnsi="Times New Roman" w:cs="Times New Roman"/>
           <w:lang w:val="es-ES"/>
         </w:rPr>
-        <w:t xml:space="preserve"> de 2026</w:t>
-      </w:r>
+      </w:pPr>
     </w:p>
     <w:p>
       <w:pPr>
@@ -2073,21 +2078,7 @@
         <w:rPr>
           <w:rFonts w:ascii="Times New Roman" w:hAnsi="Times New Roman" w:cs="Times New Roman"/>
         </w:rPr>
-        <w:t xml:space="preserve"> </w:t>
-      </w:r>
-      <w:proofErr w:type="spellStart"/>
-      <w:r>
-        <w:rPr>
-          <w:rFonts w:ascii="Times New Roman" w:hAnsi="Times New Roman" w:cs="Times New Roman"/>
-        </w:rPr>
-        <w:t>package</w:t>
-      </w:r>
-      <w:proofErr w:type="spellEnd"/>
-      <w:r>
-        <w:rPr>
-          <w:rFonts w:ascii="Times New Roman" w:hAnsi="Times New Roman" w:cs="Times New Roman"/>
-        </w:rPr>
-        <w:t>.</w:t>
+        <w:t xml:space="preserve"> package.</w:t>
       </w:r>
     </w:p>
     <w:p>

</xml_diff>